<commit_message>
사이트 수정 (2026-08-04 23:11)
</commit_message>
<xml_diff>
--- a/구성원/글로닉스 홈페이지 구성원 직책.docx
+++ b/구성원/글로닉스 홈페이지 구성원 직책.docx
@@ -723,12 +723,18 @@
       </w:r>
     </w:p>
     <w:p>
-      <w:r>
-        <w:rPr>
-          <w:rFonts w:ascii="-webkit-standard" w:hAnsi="-webkit-standard"/>
-          <w:color w:val="000000"/>
-          <w:sz w:val="27"/>
-          <w:szCs w:val="27"/>
+      <w:pPr>
+        <w:rPr>
+          <w:u w:val="single"/>
+        </w:rPr>
+      </w:pPr>
+      <w:r>
+        <w:rPr>
+          <w:rFonts w:ascii="-webkit-standard" w:hAnsi="-webkit-standard"/>
+          <w:color w:val="000000"/>
+          <w:sz w:val="27"/>
+          <w:szCs w:val="27"/>
+          <w:u w:val="single"/>
         </w:rPr>
         <w:t>자산관리</w:t>
       </w:r>
@@ -738,6 +744,7 @@
           <w:color w:val="000000"/>
           <w:sz w:val="27"/>
           <w:szCs w:val="27"/>
+          <w:u w:val="single"/>
         </w:rPr>
         <w:t xml:space="preserve"> </w:t>
       </w:r>
@@ -747,6 +754,7 @@
           <w:color w:val="000000"/>
           <w:sz w:val="27"/>
           <w:szCs w:val="27"/>
+          <w:u w:val="single"/>
         </w:rPr>
         <w:t>팀장</w:t>
       </w:r>
@@ -756,6 +764,7 @@
           <w:color w:val="000000"/>
           <w:sz w:val="27"/>
           <w:szCs w:val="27"/>
+          <w:u w:val="single"/>
         </w:rPr>
         <w:t xml:space="preserve"> (EB-5)</w:t>
       </w:r>
@@ -765,6 +774,7 @@
           <w:color w:val="000000"/>
           <w:sz w:val="27"/>
           <w:szCs w:val="27"/>
+          <w:u w:val="single"/>
         </w:rPr>
         <w:t xml:space="preserve"> (</w:t>
       </w:r>
@@ -774,6 +784,7 @@
           <w:color w:val="000000"/>
           <w:sz w:val="27"/>
           <w:szCs w:val="27"/>
+          <w:u w:val="single"/>
         </w:rPr>
         <w:t>Head of Asset Management</w:t>
       </w:r>
@@ -783,6 +794,7 @@
           <w:color w:val="000000"/>
           <w:sz w:val="27"/>
           <w:szCs w:val="27"/>
+          <w:u w:val="single"/>
         </w:rPr>
         <w:t>)</w:t>
       </w:r>

</xml_diff>